<commit_message>
them chuc nang QR
</commit_message>
<xml_diff>
--- a/wwwroot/MauDKCOt/GIAY_DK_COT.docx
+++ b/wwwroot/MauDKCOt/GIAY_DK_COT.docx
@@ -1,6 +1,6 @@
 
 <file path=word/document.xml><?xml version="1.0" encoding="utf-8"?>
-<w:document xmlns:wpc="http://schemas.microsoft.com/office/word/2010/wordprocessingCanvas" xmlns:cx="http://schemas.microsoft.com/office/drawing/2014/chartex" xmlns:cx1="http://schemas.microsoft.com/office/drawing/2015/9/8/chartex" xmlns:cx2="http://schemas.microsoft.com/office/drawing/2015/10/21/chartex" xmlns:cx3="http://schemas.microsoft.com/office/drawing/2016/5/9/chartex" xmlns:cx4="http://schemas.microsoft.com/office/drawing/2016/5/10/chartex" xmlns:cx5="http://schemas.microsoft.com/office/drawing/2016/5/11/chartex" xmlns:cx6="http://schemas.microsoft.com/office/drawing/2016/5/12/chartex" xmlns:cx7="http://schemas.microsoft.com/office/drawing/2016/5/13/chartex" xmlns:cx8="http://schemas.microsoft.com/office/drawing/2016/5/14/chartex" xmlns:mc="http://schemas.openxmlformats.org/markup-compatibility/2006" xmlns:aink="http://schemas.microsoft.com/office/drawing/2016/ink" xmlns:am3d="http://schemas.microsoft.com/office/drawing/2017/model3d" xmlns:o="urn:schemas-microsoft-com:office:office" xmlns:r="http://schemas.openxmlformats.org/officeDocument/2006/relationships" xmlns:m="http://schemas.openxmlformats.org/officeDocument/2006/math" xmlns:v="urn:schemas-microsoft-com:vml" xmlns:wp14="http://schemas.microsoft.com/office/word/2010/wordprocessingDrawing" xmlns:wp="http://schemas.openxmlformats.org/drawingml/2006/wordprocessingDrawing" xmlns:w10="urn:schemas-microsoft-com:office:word" xmlns:w="http://schemas.openxmlformats.org/wordprocessingml/2006/main" xmlns:w14="http://schemas.microsoft.com/office/word/2010/wordml" xmlns:w15="http://schemas.microsoft.com/office/word/2012/wordml" xmlns:w16cex="http://schemas.microsoft.com/office/word/2018/wordml/cex" xmlns:w16cid="http://schemas.microsoft.com/office/word/2016/wordml/cid" xmlns:w16="http://schemas.microsoft.com/office/word/2018/wordml" xmlns:w16sdtdh="http://schemas.microsoft.com/office/word/2020/wordml/sdtdatahash" xmlns:w16se="http://schemas.microsoft.com/office/word/2015/wordml/symex" xmlns:wpg="http://schemas.microsoft.com/office/word/2010/wordprocessingGroup" xmlns:wpi="http://schemas.microsoft.com/office/word/2010/wordprocessingInk" xmlns:wne="http://schemas.microsoft.com/office/word/2006/wordml" xmlns:wps="http://schemas.microsoft.com/office/word/2010/wordprocessingShape" mc:Ignorable="w14 w15 w16se w16cid w16 w16cex w16sdtdh wp14">
+<w:document xmlns:wpc="http://schemas.microsoft.com/office/word/2010/wordprocessingCanvas" xmlns:cx="http://schemas.microsoft.com/office/drawing/2014/chartex" xmlns:cx1="http://schemas.microsoft.com/office/drawing/2015/9/8/chartex" xmlns:cx2="http://schemas.microsoft.com/office/drawing/2015/10/21/chartex" xmlns:cx3="http://schemas.microsoft.com/office/drawing/2016/5/9/chartex" xmlns:cx4="http://schemas.microsoft.com/office/drawing/2016/5/10/chartex" xmlns:cx5="http://schemas.microsoft.com/office/drawing/2016/5/11/chartex" xmlns:cx6="http://schemas.microsoft.com/office/drawing/2016/5/12/chartex" xmlns:cx7="http://schemas.microsoft.com/office/drawing/2016/5/13/chartex" xmlns:cx8="http://schemas.microsoft.com/office/drawing/2016/5/14/chartex" xmlns:mc="http://schemas.openxmlformats.org/markup-compatibility/2006" xmlns:aink="http://schemas.microsoft.com/office/drawing/2016/ink" xmlns:am3d="http://schemas.microsoft.com/office/drawing/2017/model3d" xmlns:o="urn:schemas-microsoft-com:office:office" xmlns:oel="http://schemas.microsoft.com/office/2019/extlst" xmlns:r="http://schemas.openxmlformats.org/officeDocument/2006/relationships" xmlns:m="http://schemas.openxmlformats.org/officeDocument/2006/math" xmlns:v="urn:schemas-microsoft-com:vml" xmlns:wp14="http://schemas.microsoft.com/office/word/2010/wordprocessingDrawing" xmlns:wp="http://schemas.openxmlformats.org/drawingml/2006/wordprocessingDrawing" xmlns:w10="urn:schemas-microsoft-com:office:word" xmlns:w="http://schemas.openxmlformats.org/wordprocessingml/2006/main" xmlns:w14="http://schemas.microsoft.com/office/word/2010/wordml" xmlns:w15="http://schemas.microsoft.com/office/word/2012/wordml" xmlns:w16cex="http://schemas.microsoft.com/office/word/2018/wordml/cex" xmlns:w16cid="http://schemas.microsoft.com/office/word/2016/wordml/cid" xmlns:w16="http://schemas.microsoft.com/office/word/2018/wordml" xmlns:w16sdtdh="http://schemas.microsoft.com/office/word/2020/wordml/sdtdatahash" xmlns:w16se="http://schemas.microsoft.com/office/word/2015/wordml/symex" xmlns:wpg="http://schemas.microsoft.com/office/word/2010/wordprocessingGroup" xmlns:wpi="http://schemas.microsoft.com/office/word/2010/wordprocessingInk" xmlns:wne="http://schemas.microsoft.com/office/word/2006/wordml" xmlns:wps="http://schemas.microsoft.com/office/word/2010/wordprocessingShape" mc:Ignorable="w14 w15 w16se w16cid w16 w16cex w16sdtdh wp14">
   <w:body>
     <w:tbl>
       <w:tblPr>
@@ -63,7 +63,7 @@
                 <v:shape id="_x0000_s1026" type="#_x0000_t75" style="position:absolute;left:0;text-align:left;margin-left:93.35pt;margin-top:12.3pt;width:53.5pt;height:65.8pt;z-index:-251657728">
                   <v:imagedata r:id="rId6" o:title=""/>
                 </v:shape>
-                <o:OLEObject Type="Embed" ProgID="CorelDraw.Graphic.24" ShapeID="_x0000_s1026" DrawAspect="Content" ObjectID="_1811696991" r:id="rId7"/>
+                <o:OLEObject Type="Embed" ProgID="CorelDraw.Graphic.24" ShapeID="_x0000_s1026" DrawAspect="Content" ObjectID="_1851228534" r:id="rId7"/>
               </w:object>
             </w:r>
             <w:r>
@@ -280,7 +280,6 @@
                   <w:docPart w:val="DefaultPlaceholder_-1854013440"/>
                 </w:placeholder>
               </w:sdtPr>
-              <w:sdtEndPr/>
               <w:sdtContent>
                 <w:r>
                   <w:rPr>
@@ -328,137 +327,254 @@
             <w:tcW w:w="10790" w:type="dxa"/>
             <w:gridSpan w:val="2"/>
           </w:tcPr>
-          <w:p>
-            <w:pPr>
-              <w:jc w:val="center"/>
-              <w:rPr>
-                <w:rFonts w:ascii="Times New Roman" w:hAnsi="Times New Roman" w:cs="Times New Roman"/>
-                <w:b/>
-                <w:bCs/>
-                <w:color w:val="EE0000"/>
-                <w:sz w:val="40"/>
-                <w:szCs w:val="40"/>
-              </w:rPr>
-            </w:pPr>
-            <w:r>
-              <w:rPr>
-                <w:rFonts w:ascii="Times New Roman" w:hAnsi="Times New Roman" w:cs="Times New Roman"/>
-                <w:b/>
-                <w:bCs/>
-                <w:noProof/>
-                <w:color w:val="EE0000"/>
-                <w:sz w:val="40"/>
-                <w:szCs w:val="40"/>
-              </w:rPr>
-              <w:drawing>
-                <wp:anchor distT="0" distB="0" distL="114300" distR="114300" simplePos="0" relativeHeight="251656704" behindDoc="1" locked="0" layoutInCell="1" allowOverlap="1" wp14:anchorId="4BD0A5AC" wp14:editId="25CB76F2">
-                  <wp:simplePos x="0" y="0"/>
-                  <wp:positionH relativeFrom="column">
-                    <wp:posOffset>956945</wp:posOffset>
-                  </wp:positionH>
-                  <wp:positionV relativeFrom="paragraph">
-                    <wp:posOffset>294005</wp:posOffset>
-                  </wp:positionV>
-                  <wp:extent cx="4813300" cy="6425864"/>
-                  <wp:effectExtent l="0" t="0" r="6350" b="0"/>
-                  <wp:wrapNone/>
-                  <wp:docPr id="1912340995" name="Hình ảnh 1"/>
-                  <wp:cNvGraphicFramePr>
-                    <a:graphicFrameLocks xmlns:a="http://schemas.openxmlformats.org/drawingml/2006/main" noChangeAspect="1"/>
-                  </wp:cNvGraphicFramePr>
-                  <a:graphic xmlns:a="http://schemas.openxmlformats.org/drawingml/2006/main">
-                    <a:graphicData uri="http://schemas.openxmlformats.org/drawingml/2006/picture">
-                      <pic:pic xmlns:pic="http://schemas.openxmlformats.org/drawingml/2006/picture">
-                        <pic:nvPicPr>
-                          <pic:cNvPr id="1912340995" name="Hình ảnh 1912340995"/>
-                          <pic:cNvPicPr/>
-                        </pic:nvPicPr>
-                        <pic:blipFill>
-                          <a:blip r:embed="rId8" cstate="print">
-                            <a:extLst>
-                              <a:ext uri="{28A0092B-C50C-407E-A947-70E740481C1C}">
-                                <a14:useLocalDpi xmlns:a14="http://schemas.microsoft.com/office/drawing/2010/main" val="0"/>
-                              </a:ext>
-                            </a:extLst>
-                          </a:blip>
-                          <a:stretch>
-                            <a:fillRect/>
-                          </a:stretch>
-                        </pic:blipFill>
-                        <pic:spPr>
-                          <a:xfrm>
-                            <a:off x="0" y="0"/>
-                            <a:ext cx="4813300" cy="6425864"/>
-                          </a:xfrm>
-                          <a:prstGeom prst="rect">
-                            <a:avLst/>
-                          </a:prstGeom>
-                        </pic:spPr>
-                      </pic:pic>
-                    </a:graphicData>
-                  </a:graphic>
-                  <wp14:sizeRelH relativeFrom="page">
-                    <wp14:pctWidth>0</wp14:pctWidth>
-                  </wp14:sizeRelH>
-                  <wp14:sizeRelV relativeFrom="page">
-                    <wp14:pctHeight>0</wp14:pctHeight>
-                  </wp14:sizeRelV>
-                </wp:anchor>
-              </w:drawing>
-            </w:r>
-            <w:r>
-              <w:rPr>
-                <w:rFonts w:ascii="Times New Roman" w:hAnsi="Times New Roman" w:cs="Times New Roman"/>
-                <w:b/>
-                <w:bCs/>
-                <w:color w:val="EE0000"/>
-                <w:sz w:val="40"/>
-                <w:szCs w:val="40"/>
-              </w:rPr>
-              <w:t>ĐƠN XIN ĐĂNG KÝ TRÍ CỐT</w:t>
-            </w:r>
-          </w:p>
-          <w:p>
-            <w:pPr>
-              <w:jc w:val="center"/>
-              <w:rPr>
-                <w:rFonts w:ascii="Times New Roman" w:hAnsi="Times New Roman" w:cs="Times New Roman"/>
-                <w:sz w:val="28"/>
-                <w:szCs w:val="28"/>
-              </w:rPr>
-            </w:pPr>
-            <w:r>
-              <w:rPr>
-                <w:rFonts w:ascii="Times New Roman" w:hAnsi="Times New Roman" w:cs="Times New Roman"/>
-                <w:sz w:val="28"/>
-                <w:szCs w:val="28"/>
-              </w:rPr>
-              <w:t>.....o0o.....</w:t>
-            </w:r>
-          </w:p>
-          <w:p>
-            <w:pPr>
-              <w:spacing w:line="360" w:lineRule="auto"/>
-              <w:jc w:val="center"/>
-              <w:rPr>
-                <w:rFonts w:ascii="Times New Roman" w:hAnsi="Times New Roman" w:cs="Times New Roman"/>
-                <w:i/>
-                <w:iCs/>
-                <w:sz w:val="28"/>
-                <w:szCs w:val="28"/>
-              </w:rPr>
-            </w:pPr>
-            <w:r>
-              <w:rPr>
-                <w:rFonts w:ascii="Times New Roman" w:hAnsi="Times New Roman" w:cs="Times New Roman"/>
-                <w:i/>
-                <w:iCs/>
-                <w:sz w:val="28"/>
-                <w:szCs w:val="28"/>
-              </w:rPr>
-              <w:t>Kính gửi: Thầy Trụ Trì Chùa Bửu Đà</w:t>
-            </w:r>
-          </w:p>
+          <w:tbl>
+            <w:tblPr>
+              <w:tblStyle w:val="TableGrid"/>
+              <w:tblW w:w="0" w:type="auto"/>
+              <w:tblBorders>
+                <w:top w:val="none" w:sz="0" w:space="0" w:color="auto"/>
+                <w:left w:val="none" w:sz="0" w:space="0" w:color="auto"/>
+                <w:bottom w:val="none" w:sz="0" w:space="0" w:color="auto"/>
+                <w:right w:val="none" w:sz="0" w:space="0" w:color="auto"/>
+                <w:insideH w:val="none" w:sz="0" w:space="0" w:color="auto"/>
+                <w:insideV w:val="none" w:sz="0" w:space="0" w:color="auto"/>
+              </w:tblBorders>
+              <w:tblLook w:val="04A0" w:firstRow="1" w:lastRow="0" w:firstColumn="1" w:lastColumn="0" w:noHBand="0" w:noVBand="1"/>
+            </w:tblPr>
+            <w:tblGrid>
+              <w:gridCol w:w="9101"/>
+              <w:gridCol w:w="1463"/>
+            </w:tblGrid>
+            <w:tr>
+              <w:trPr>
+                <w:trHeight w:val="1407"/>
+              </w:trPr>
+              <w:tc>
+                <w:tcPr>
+                  <w:tcW w:w="9101" w:type="dxa"/>
+                </w:tcPr>
+                <w:p>
+                  <w:pPr>
+                    <w:jc w:val="center"/>
+                    <w:rPr>
+                      <w:rFonts w:ascii="Times New Roman" w:hAnsi="Times New Roman" w:cs="Times New Roman"/>
+                      <w:b/>
+                      <w:bCs/>
+                      <w:color w:val="EE0000"/>
+                      <w:sz w:val="40"/>
+                      <w:szCs w:val="40"/>
+                    </w:rPr>
+                  </w:pPr>
+                  <w:r>
+                    <w:rPr>
+                      <w:rFonts w:ascii="Times New Roman" w:hAnsi="Times New Roman" w:cs="Times New Roman"/>
+                      <w:b/>
+                      <w:bCs/>
+                      <w:noProof/>
+                      <w:color w:val="EE0000"/>
+                      <w:sz w:val="40"/>
+                      <w:szCs w:val="40"/>
+                    </w:rPr>
+                    <w:drawing>
+                      <wp:anchor distT="0" distB="0" distL="114300" distR="114300" simplePos="0" relativeHeight="251657728" behindDoc="1" locked="0" layoutInCell="1" allowOverlap="1" wp14:anchorId="7ADE3A06" wp14:editId="3A64E01B">
+                        <wp:simplePos x="0" y="0"/>
+                        <wp:positionH relativeFrom="column">
+                          <wp:posOffset>956945</wp:posOffset>
+                        </wp:positionH>
+                        <wp:positionV relativeFrom="paragraph">
+                          <wp:posOffset>294005</wp:posOffset>
+                        </wp:positionV>
+                        <wp:extent cx="4813300" cy="6425864"/>
+                        <wp:effectExtent l="0" t="0" r="6350" b="0"/>
+                        <wp:wrapNone/>
+                        <wp:docPr id="1912340995" name="Hình ảnh 1"/>
+                        <wp:cNvGraphicFramePr>
+                          <a:graphicFrameLocks xmlns:a="http://schemas.openxmlformats.org/drawingml/2006/main" noChangeAspect="1"/>
+                        </wp:cNvGraphicFramePr>
+                        <a:graphic xmlns:a="http://schemas.openxmlformats.org/drawingml/2006/main">
+                          <a:graphicData uri="http://schemas.openxmlformats.org/drawingml/2006/picture">
+                            <pic:pic xmlns:pic="http://schemas.openxmlformats.org/drawingml/2006/picture">
+                              <pic:nvPicPr>
+                                <pic:cNvPr id="1912340995" name="Hình ảnh 1912340995"/>
+                                <pic:cNvPicPr/>
+                              </pic:nvPicPr>
+                              <pic:blipFill>
+                                <a:blip r:embed="rId8" cstate="print">
+                                  <a:extLst>
+                                    <a:ext uri="{28A0092B-C50C-407E-A947-70E740481C1C}">
+                                      <a14:useLocalDpi xmlns:a14="http://schemas.microsoft.com/office/drawing/2010/main" val="0"/>
+                                    </a:ext>
+                                  </a:extLst>
+                                </a:blip>
+                                <a:stretch>
+                                  <a:fillRect/>
+                                </a:stretch>
+                              </pic:blipFill>
+                              <pic:spPr>
+                                <a:xfrm>
+                                  <a:off x="0" y="0"/>
+                                  <a:ext cx="4813300" cy="6425864"/>
+                                </a:xfrm>
+                                <a:prstGeom prst="rect">
+                                  <a:avLst/>
+                                </a:prstGeom>
+                              </pic:spPr>
+                            </pic:pic>
+                          </a:graphicData>
+                        </a:graphic>
+                        <wp14:sizeRelH relativeFrom="page">
+                          <wp14:pctWidth>0</wp14:pctWidth>
+                        </wp14:sizeRelH>
+                        <wp14:sizeRelV relativeFrom="page">
+                          <wp14:pctHeight>0</wp14:pctHeight>
+                        </wp14:sizeRelV>
+                      </wp:anchor>
+                    </w:drawing>
+                  </w:r>
+                  <w:r>
+                    <w:rPr>
+                      <w:rFonts w:ascii="Times New Roman" w:hAnsi="Times New Roman" w:cs="Times New Roman"/>
+                      <w:b/>
+                      <w:bCs/>
+                      <w:color w:val="EE0000"/>
+                      <w:sz w:val="40"/>
+                      <w:szCs w:val="40"/>
+                    </w:rPr>
+                    <w:t>ĐƠN XIN ĐĂNG KÝ TRÍ CỐT</w:t>
+                  </w:r>
+                </w:p>
+                <w:p>
+                  <w:pPr>
+                    <w:jc w:val="center"/>
+                    <w:rPr>
+                      <w:rFonts w:ascii="Times New Roman" w:hAnsi="Times New Roman" w:cs="Times New Roman"/>
+                      <w:sz w:val="28"/>
+                      <w:szCs w:val="28"/>
+                    </w:rPr>
+                  </w:pPr>
+                  <w:r>
+                    <w:rPr>
+                      <w:rFonts w:ascii="Times New Roman" w:hAnsi="Times New Roman" w:cs="Times New Roman"/>
+                      <w:sz w:val="28"/>
+                      <w:szCs w:val="28"/>
+                    </w:rPr>
+                    <w:t>.....o0o.....</w:t>
+                  </w:r>
+                </w:p>
+                <w:p>
+                  <w:pPr>
+                    <w:spacing w:line="360" w:lineRule="auto"/>
+                    <w:jc w:val="center"/>
+                    <w:rPr>
+                      <w:rFonts w:ascii="Times New Roman" w:hAnsi="Times New Roman" w:cs="Times New Roman"/>
+                      <w:i/>
+                      <w:iCs/>
+                      <w:sz w:val="28"/>
+                      <w:szCs w:val="28"/>
+                    </w:rPr>
+                  </w:pPr>
+                  <w:r>
+                    <w:rPr>
+                      <w:rFonts w:ascii="Times New Roman" w:hAnsi="Times New Roman" w:cs="Times New Roman"/>
+                      <w:i/>
+                      <w:iCs/>
+                      <w:sz w:val="28"/>
+                      <w:szCs w:val="28"/>
+                    </w:rPr>
+                    <w:t>Kính gửi: Thầy Trụ Trì Chùa Bửu Đà</w:t>
+                  </w:r>
+                </w:p>
+              </w:tc>
+              <w:sdt>
+                <w:sdtPr>
+                  <w:rPr>
+                    <w:rFonts w:ascii="Times New Roman" w:hAnsi="Times New Roman" w:cs="Times New Roman"/>
+                    <w:sz w:val="28"/>
+                    <w:szCs w:val="28"/>
+                  </w:rPr>
+                  <w:alias w:val="QRCode"/>
+                  <w:tag w:val="QRCode"/>
+                  <w:id w:val="326631054"/>
+                  <w:showingPlcHdr/>
+                  <w:picture/>
+                </w:sdtPr>
+                <w:sdtContent>
+                  <w:tc>
+                    <w:tcPr>
+                      <w:tcW w:w="1463" w:type="dxa"/>
+                    </w:tcPr>
+                    <w:p>
+                      <w:pPr>
+                        <w:spacing w:line="360" w:lineRule="auto"/>
+                        <w:jc w:val="center"/>
+                        <w:rPr>
+                          <w:rFonts w:ascii="Times New Roman" w:hAnsi="Times New Roman" w:cs="Times New Roman"/>
+                          <w:sz w:val="28"/>
+                          <w:szCs w:val="28"/>
+                        </w:rPr>
+                      </w:pPr>
+                      <w:r>
+                        <w:rPr>
+                          <w:rFonts w:ascii="Times New Roman" w:hAnsi="Times New Roman" w:cs="Times New Roman"/>
+                          <w:noProof/>
+                          <w:sz w:val="28"/>
+                          <w:szCs w:val="28"/>
+                        </w:rPr>
+                        <w:drawing>
+                          <wp:inline distT="0" distB="0" distL="0" distR="0" wp14:anchorId="24EC5E45" wp14:editId="165A27CF">
+                            <wp:extent cx="594360" cy="594360"/>
+                            <wp:effectExtent l="0" t="0" r="0" b="0"/>
+                            <wp:docPr id="1" name="Picture 2"/>
+                            <wp:cNvGraphicFramePr>
+                              <a:graphicFrameLocks xmlns:a="http://schemas.openxmlformats.org/drawingml/2006/main" noChangeAspect="1"/>
+                            </wp:cNvGraphicFramePr>
+                            <a:graphic xmlns:a="http://schemas.openxmlformats.org/drawingml/2006/main">
+                              <a:graphicData uri="http://schemas.openxmlformats.org/drawingml/2006/picture">
+                                <pic:pic xmlns:pic="http://schemas.openxmlformats.org/drawingml/2006/picture">
+                                  <pic:nvPicPr>
+                                    <pic:cNvPr id="0" name="Picture 2"/>
+                                    <pic:cNvPicPr>
+                                      <a:picLocks noChangeAspect="1" noChangeArrowheads="1"/>
+                                    </pic:cNvPicPr>
+                                  </pic:nvPicPr>
+                                  <pic:blipFill>
+                                    <a:blip r:embed="rId9" cstate="print">
+                                      <a:extLst>
+                                        <a:ext uri="{28A0092B-C50C-407E-A947-70E740481C1C}">
+                                          <a14:useLocalDpi xmlns:a14="http://schemas.microsoft.com/office/drawing/2010/main" val="0"/>
+                                        </a:ext>
+                                      </a:extLst>
+                                    </a:blip>
+                                    <a:srcRect/>
+                                    <a:stretch>
+                                      <a:fillRect/>
+                                    </a:stretch>
+                                  </pic:blipFill>
+                                  <pic:spPr bwMode="auto">
+                                    <a:xfrm>
+                                      <a:off x="0" y="0"/>
+                                      <a:ext cx="594360" cy="594360"/>
+                                    </a:xfrm>
+                                    <a:prstGeom prst="rect">
+                                      <a:avLst/>
+                                    </a:prstGeom>
+                                    <a:noFill/>
+                                    <a:ln>
+                                      <a:noFill/>
+                                    </a:ln>
+                                  </pic:spPr>
+                                </pic:pic>
+                              </a:graphicData>
+                            </a:graphic>
+                          </wp:inline>
+                        </w:drawing>
+                      </w:r>
+                    </w:p>
+                  </w:tc>
+                </w:sdtContent>
+              </w:sdt>
+            </w:tr>
+          </w:tbl>
           <w:p>
             <w:pPr>
               <w:spacing w:line="360" w:lineRule="auto"/>
@@ -500,7 +616,6 @@
                 </w:placeholder>
                 <w:showingPlcHdr/>
               </w:sdtPr>
-              <w:sdtEndPr/>
               <w:sdtContent>
                 <w:r>
                   <w:rPr>
@@ -552,7 +667,6 @@
                   <w:docPart w:val="DAA0B040BE5A4F719E1DE97FCDFAB244"/>
                 </w:placeholder>
               </w:sdtPr>
-              <w:sdtEndPr/>
               <w:sdtContent>
                 <w:r>
                   <w:rPr>
@@ -599,7 +713,6 @@
                   <w:docPart w:val="DefaultPlaceholder_-1854013440"/>
                 </w:placeholder>
               </w:sdtPr>
-              <w:sdtEndPr/>
               <w:sdtContent>
                 <w:r>
                   <w:rPr>
@@ -670,7 +783,6 @@
                   <w:docPart w:val="DefaultPlaceholder_-1854013440"/>
                 </w:placeholder>
               </w:sdtPr>
-              <w:sdtEndPr/>
               <w:sdtContent>
                 <w:r>
                   <w:rPr>
@@ -723,7 +835,6 @@
                   <w:docPart w:val="DefaultPlaceholder_-1854013440"/>
                 </w:placeholder>
               </w:sdtPr>
-              <w:sdtEndPr/>
               <w:sdtContent>
                 <w:r>
                   <w:rPr>
@@ -776,7 +887,6 @@
                   <w:docPart w:val="DefaultPlaceholder_-1854013440"/>
                 </w:placeholder>
               </w:sdtPr>
-              <w:sdtEndPr/>
               <w:sdtContent>
                 <w:r>
                   <w:rPr>
@@ -830,7 +940,6 @@
                   <w:docPart w:val="CC302AC856994C218999E6D66CC3F9A1"/>
                 </w:placeholder>
               </w:sdtPr>
-              <w:sdtEndPr/>
               <w:sdtContent>
                 <w:r>
                   <w:rPr>
@@ -885,7 +994,6 @@
                   <w:docPart w:val="DefaultPlaceholder_-1854013440"/>
                 </w:placeholder>
               </w:sdtPr>
-              <w:sdtEndPr/>
               <w:sdtContent>
                 <w:r>
                   <w:rPr>
@@ -973,7 +1081,6 @@
                   <w:docPart w:val="DefaultPlaceholder_-1854013440"/>
                 </w:placeholder>
               </w:sdtPr>
-              <w:sdtEndPr/>
               <w:sdtContent>
                 <w:r>
                   <w:rPr>
@@ -1025,7 +1132,6 @@
                   <w:docPart w:val="FE2BB84DED6C4E77A433DE97EFD43720"/>
                 </w:placeholder>
               </w:sdtPr>
-              <w:sdtEndPr/>
               <w:sdtContent>
                 <w:r>
                   <w:rPr>
@@ -1080,7 +1186,6 @@
                   <w:docPart w:val="DefaultPlaceholder_-1854013440"/>
                 </w:placeholder>
               </w:sdtPr>
-              <w:sdtEndPr/>
               <w:sdtContent>
                 <w:r>
                   <w:rPr>
@@ -1133,7 +1238,6 @@
                   <w:docPart w:val="DefaultPlaceholder_-1854013440"/>
                 </w:placeholder>
               </w:sdtPr>
-              <w:sdtEndPr/>
               <w:sdtContent>
                 <w:r>
                   <w:rPr>
@@ -1182,7 +1286,6 @@
                   <w:docPart w:val="DefaultPlaceholder_-1854013440"/>
                 </w:placeholder>
               </w:sdtPr>
-              <w:sdtEndPr/>
               <w:sdtContent>
                 <w:r>
                   <w:rPr>
@@ -1257,7 +1360,6 @@
                   <w:docPart w:val="DefaultPlaceholder_-1854013440"/>
                 </w:placeholder>
               </w:sdtPr>
-              <w:sdtEndPr/>
               <w:sdtContent>
                 <w:r>
                   <w:rPr>
@@ -1318,7 +1420,6 @@
                   <w:docPart w:val="DefaultPlaceholder_-1854013440"/>
                 </w:placeholder>
               </w:sdtPr>
-              <w:sdtEndPr/>
               <w:sdtContent>
                 <w:r>
                   <w:rPr>
@@ -1387,7 +1488,6 @@
                   <w:docPart w:val="DefaultPlaceholder_-1854013440"/>
                 </w:placeholder>
               </w:sdtPr>
-              <w:sdtEndPr/>
               <w:sdtContent>
                 <w:r>
                   <w:rPr>
@@ -1440,7 +1540,6 @@
                   <w:docPart w:val="DefaultPlaceholder_-1854013440"/>
                 </w:placeholder>
               </w:sdtPr>
-              <w:sdtEndPr/>
               <w:sdtContent>
                 <w:r>
                   <w:rPr>
@@ -1506,7 +1605,6 @@
                   <w:docPart w:val="DefaultPlaceholder_-1854013440"/>
                 </w:placeholder>
               </w:sdtPr>
-              <w:sdtEndPr/>
               <w:sdtContent>
                 <w:r>
                   <w:rPr>
@@ -1609,7 +1707,6 @@
                   <w:docPart w:val="DefaultPlaceholder_-1854013440"/>
                 </w:placeholder>
               </w:sdtPr>
-              <w:sdtEndPr/>
               <w:sdtContent>
                 <w:r>
                   <w:rPr>
@@ -1678,7 +1775,6 @@
                   <w:docPart w:val="DefaultPlaceholder_-1854013440"/>
                 </w:placeholder>
               </w:sdtPr>
-              <w:sdtEndPr/>
               <w:sdtContent>
                 <w:r>
                   <w:rPr>
@@ -2203,7 +2299,7 @@
           <w:szCs w:val="28"/>
         </w:rPr>
         <w:drawing>
-          <wp:anchor distT="0" distB="0" distL="114300" distR="114300" simplePos="0" relativeHeight="251657728" behindDoc="1" locked="0" layoutInCell="1" allowOverlap="1" wp14:anchorId="25AD3E9D" wp14:editId="4BB6F02E">
+          <wp:anchor distT="0" distB="0" distL="114300" distR="114300" simplePos="0" relativeHeight="251656704" behindDoc="1" locked="0" layoutInCell="1" allowOverlap="1" wp14:anchorId="25AD3E9D" wp14:editId="4BB6F02E">
             <wp:simplePos x="0" y="0"/>
             <wp:positionH relativeFrom="margin">
               <wp:align>right</wp:align>
@@ -2226,7 +2322,7 @@
                     <pic:cNvPicPr/>
                   </pic:nvPicPr>
                   <pic:blipFill>
-                    <a:blip r:embed="rId9" cstate="print">
+                    <a:blip r:embed="rId10" cstate="print">
                       <a:extLst>
                         <a:ext uri="{28A0092B-C50C-407E-A947-70E740481C1C}">
                           <a14:useLocalDpi xmlns:a14="http://schemas.microsoft.com/office/drawing/2010/main" val="0"/>
@@ -2412,7 +2508,6 @@
           </w:placeholder>
           <w:showingPlcHdr/>
         </w:sdtPr>
-        <w:sdtEndPr/>
         <w:sdtContent>
           <w:r>
             <w:rPr>
@@ -2456,7 +2551,6 @@
             <w:docPart w:val="65320A6CC3C34AFBB8890A9D838700DA"/>
           </w:placeholder>
         </w:sdtPr>
-        <w:sdtEndPr/>
         <w:sdtContent>
           <w:r>
             <w:rPr>
@@ -2526,7 +2620,6 @@
             <w:docPart w:val="C5FD6431DE9E43F6B9814C60079241C1"/>
           </w:placeholder>
         </w:sdtPr>
-        <w:sdtEndPr/>
         <w:sdtContent>
           <w:r>
             <w:rPr>
@@ -2646,7 +2739,6 @@
             <w:docPart w:val="DE7300D8A6CE4A1F8D7903A0E1083898"/>
           </w:placeholder>
         </w:sdtPr>
-        <w:sdtEndPr/>
         <w:sdtContent>
           <w:r>
             <w:rPr>
@@ -2749,7 +2841,6 @@
             <w:docPart w:val="85E0B736A93B4056884AE20E4F31979A"/>
           </w:placeholder>
         </w:sdtPr>
-        <w:sdtEndPr/>
         <w:sdtContent>
           <w:r>
             <w:rPr>
@@ -2793,7 +2884,6 @@
             <w:docPart w:val="213BD0E9A8E94E38A47C2DFDF44DF4EE"/>
           </w:placeholder>
         </w:sdtPr>
-        <w:sdtEndPr/>
         <w:sdtContent>
           <w:r>
             <w:rPr>
@@ -3129,7 +3219,7 @@
 </file>
 
 <file path=word/numbering.xml><?xml version="1.0" encoding="utf-8"?>
-<w:numbering xmlns:wpc="http://schemas.microsoft.com/office/word/2010/wordprocessingCanvas" xmlns:cx="http://schemas.microsoft.com/office/drawing/2014/chartex" xmlns:cx1="http://schemas.microsoft.com/office/drawing/2015/9/8/chartex" xmlns:cx2="http://schemas.microsoft.com/office/drawing/2015/10/21/chartex" xmlns:cx3="http://schemas.microsoft.com/office/drawing/2016/5/9/chartex" xmlns:cx4="http://schemas.microsoft.com/office/drawing/2016/5/10/chartex" xmlns:cx5="http://schemas.microsoft.com/office/drawing/2016/5/11/chartex" xmlns:cx6="http://schemas.microsoft.com/office/drawing/2016/5/12/chartex" xmlns:cx7="http://schemas.microsoft.com/office/drawing/2016/5/13/chartex" xmlns:cx8="http://schemas.microsoft.com/office/drawing/2016/5/14/chartex" xmlns:mc="http://schemas.openxmlformats.org/markup-compatibility/2006" xmlns:aink="http://schemas.microsoft.com/office/drawing/2016/ink" xmlns:am3d="http://schemas.microsoft.com/office/drawing/2017/model3d" xmlns:o="urn:schemas-microsoft-com:office:office" xmlns:r="http://schemas.openxmlformats.org/officeDocument/2006/relationships" xmlns:m="http://schemas.openxmlformats.org/officeDocument/2006/math" xmlns:v="urn:schemas-microsoft-com:vml" xmlns:wp14="http://schemas.microsoft.com/office/word/2010/wordprocessingDrawing" xmlns:wp="http://schemas.openxmlformats.org/drawingml/2006/wordprocessingDrawing" xmlns:w10="urn:schemas-microsoft-com:office:word" xmlns:w="http://schemas.openxmlformats.org/wordprocessingml/2006/main" xmlns:w14="http://schemas.microsoft.com/office/word/2010/wordml" xmlns:w15="http://schemas.microsoft.com/office/word/2012/wordml" xmlns:w16cex="http://schemas.microsoft.com/office/word/2018/wordml/cex" xmlns:w16cid="http://schemas.microsoft.com/office/word/2016/wordml/cid" xmlns:w16="http://schemas.microsoft.com/office/word/2018/wordml" xmlns:w16sdtdh="http://schemas.microsoft.com/office/word/2020/wordml/sdtdatahash" xmlns:w16se="http://schemas.microsoft.com/office/word/2015/wordml/symex" xmlns:wpg="http://schemas.microsoft.com/office/word/2010/wordprocessingGroup" xmlns:wpi="http://schemas.microsoft.com/office/word/2010/wordprocessingInk" xmlns:wne="http://schemas.microsoft.com/office/word/2006/wordml" xmlns:wps="http://schemas.microsoft.com/office/word/2010/wordprocessingShape" mc:Ignorable="w14 w15 w16se w16cid w16 w16cex w16sdtdh wp14">
+<w:numbering xmlns:wpc="http://schemas.microsoft.com/office/word/2010/wordprocessingCanvas" xmlns:cx="http://schemas.microsoft.com/office/drawing/2014/chartex" xmlns:cx1="http://schemas.microsoft.com/office/drawing/2015/9/8/chartex" xmlns:cx2="http://schemas.microsoft.com/office/drawing/2015/10/21/chartex" xmlns:cx3="http://schemas.microsoft.com/office/drawing/2016/5/9/chartex" xmlns:cx4="http://schemas.microsoft.com/office/drawing/2016/5/10/chartex" xmlns:cx5="http://schemas.microsoft.com/office/drawing/2016/5/11/chartex" xmlns:cx6="http://schemas.microsoft.com/office/drawing/2016/5/12/chartex" xmlns:cx7="http://schemas.microsoft.com/office/drawing/2016/5/13/chartex" xmlns:cx8="http://schemas.microsoft.com/office/drawing/2016/5/14/chartex" xmlns:mc="http://schemas.openxmlformats.org/markup-compatibility/2006" xmlns:aink="http://schemas.microsoft.com/office/drawing/2016/ink" xmlns:am3d="http://schemas.microsoft.com/office/drawing/2017/model3d" xmlns:o="urn:schemas-microsoft-com:office:office" xmlns:oel="http://schemas.microsoft.com/office/2019/extlst" xmlns:r="http://schemas.openxmlformats.org/officeDocument/2006/relationships" xmlns:m="http://schemas.openxmlformats.org/officeDocument/2006/math" xmlns:v="urn:schemas-microsoft-com:vml" xmlns:wp14="http://schemas.microsoft.com/office/word/2010/wordprocessingDrawing" xmlns:wp="http://schemas.openxmlformats.org/drawingml/2006/wordprocessingDrawing" xmlns:w10="urn:schemas-microsoft-com:office:word" xmlns:w="http://schemas.openxmlformats.org/wordprocessingml/2006/main" xmlns:w14="http://schemas.microsoft.com/office/word/2010/wordml" xmlns:w15="http://schemas.microsoft.com/office/word/2012/wordml" xmlns:w16cex="http://schemas.microsoft.com/office/word/2018/wordml/cex" xmlns:w16cid="http://schemas.microsoft.com/office/word/2016/wordml/cid" xmlns:w16="http://schemas.microsoft.com/office/word/2018/wordml" xmlns:w16sdtdh="http://schemas.microsoft.com/office/word/2020/wordml/sdtdatahash" xmlns:w16se="http://schemas.microsoft.com/office/word/2015/wordml/symex" xmlns:wpg="http://schemas.microsoft.com/office/word/2010/wordprocessingGroup" xmlns:wpi="http://schemas.microsoft.com/office/word/2010/wordprocessingInk" xmlns:wne="http://schemas.microsoft.com/office/word/2006/wordml" xmlns:wps="http://schemas.microsoft.com/office/word/2010/wordprocessingShape" mc:Ignorable="w14 w15 w16se w16cid w16 w16cex w16sdtdh wp14">
   <w:abstractNum w:abstractNumId="0" w15:restartNumberingAfterBreak="0">
     <w:nsid w:val="1D904E65"/>
     <w:multiLevelType w:val="hybridMultilevel"/>
@@ -3242,7 +3332,7 @@
       </w:rPr>
     </w:lvl>
   </w:abstractNum>
-  <w:num w:numId="1">
+  <w:num w:numId="1" w16cid:durableId="617958261">
     <w:abstractNumId w:val="0"/>
   </w:num>
 </w:numbering>
@@ -4267,7 +4357,7 @@
 </file>
 
 <file path=word/glossary/document.xml><?xml version="1.0" encoding="utf-8"?>
-<w:glossaryDocument xmlns:wpc="http://schemas.microsoft.com/office/word/2010/wordprocessingCanvas" xmlns:cx="http://schemas.microsoft.com/office/drawing/2014/chartex" xmlns:cx1="http://schemas.microsoft.com/office/drawing/2015/9/8/chartex" xmlns:cx2="http://schemas.microsoft.com/office/drawing/2015/10/21/chartex" xmlns:cx3="http://schemas.microsoft.com/office/drawing/2016/5/9/chartex" xmlns:cx4="http://schemas.microsoft.com/office/drawing/2016/5/10/chartex" xmlns:cx5="http://schemas.microsoft.com/office/drawing/2016/5/11/chartex" xmlns:cx6="http://schemas.microsoft.com/office/drawing/2016/5/12/chartex" xmlns:cx7="http://schemas.microsoft.com/office/drawing/2016/5/13/chartex" xmlns:cx8="http://schemas.microsoft.com/office/drawing/2016/5/14/chartex" xmlns:mc="http://schemas.openxmlformats.org/markup-compatibility/2006" xmlns:aink="http://schemas.microsoft.com/office/drawing/2016/ink" xmlns:am3d="http://schemas.microsoft.com/office/drawing/2017/model3d" xmlns:o="urn:schemas-microsoft-com:office:office" xmlns:r="http://schemas.openxmlformats.org/officeDocument/2006/relationships" xmlns:m="http://schemas.openxmlformats.org/officeDocument/2006/math" xmlns:v="urn:schemas-microsoft-com:vml" xmlns:wp14="http://schemas.microsoft.com/office/word/2010/wordprocessingDrawing" xmlns:wp="http://schemas.openxmlformats.org/drawingml/2006/wordprocessingDrawing" xmlns:w10="urn:schemas-microsoft-com:office:word" xmlns:w="http://schemas.openxmlformats.org/wordprocessingml/2006/main" xmlns:w14="http://schemas.microsoft.com/office/word/2010/wordml" xmlns:w15="http://schemas.microsoft.com/office/word/2012/wordml" xmlns:w16cex="http://schemas.microsoft.com/office/word/2018/wordml/cex" xmlns:w16cid="http://schemas.microsoft.com/office/word/2016/wordml/cid" xmlns:w16="http://schemas.microsoft.com/office/word/2018/wordml" xmlns:w16sdtdh="http://schemas.microsoft.com/office/word/2020/wordml/sdtdatahash" xmlns:w16se="http://schemas.microsoft.com/office/word/2015/wordml/symex" xmlns:wpg="http://schemas.microsoft.com/office/word/2010/wordprocessingGroup" xmlns:wpi="http://schemas.microsoft.com/office/word/2010/wordprocessingInk" xmlns:wne="http://schemas.microsoft.com/office/word/2006/wordml" xmlns:wps="http://schemas.microsoft.com/office/word/2010/wordprocessingShape" mc:Ignorable="w14 w15 w16se w16cid w16 w16cex w16sdtdh wp14">
+<w:glossaryDocument xmlns:wpc="http://schemas.microsoft.com/office/word/2010/wordprocessingCanvas" xmlns:cx="http://schemas.microsoft.com/office/drawing/2014/chartex" xmlns:cx1="http://schemas.microsoft.com/office/drawing/2015/9/8/chartex" xmlns:cx2="http://schemas.microsoft.com/office/drawing/2015/10/21/chartex" xmlns:cx3="http://schemas.microsoft.com/office/drawing/2016/5/9/chartex" xmlns:cx4="http://schemas.microsoft.com/office/drawing/2016/5/10/chartex" xmlns:cx5="http://schemas.microsoft.com/office/drawing/2016/5/11/chartex" xmlns:cx6="http://schemas.microsoft.com/office/drawing/2016/5/12/chartex" xmlns:cx7="http://schemas.microsoft.com/office/drawing/2016/5/13/chartex" xmlns:cx8="http://schemas.microsoft.com/office/drawing/2016/5/14/chartex" xmlns:mc="http://schemas.openxmlformats.org/markup-compatibility/2006" xmlns:aink="http://schemas.microsoft.com/office/drawing/2016/ink" xmlns:am3d="http://schemas.microsoft.com/office/drawing/2017/model3d" xmlns:o="urn:schemas-microsoft-com:office:office" xmlns:oel="http://schemas.microsoft.com/office/2019/extlst" xmlns:r="http://schemas.openxmlformats.org/officeDocument/2006/relationships" xmlns:m="http://schemas.openxmlformats.org/officeDocument/2006/math" xmlns:v="urn:schemas-microsoft-com:vml" xmlns:wp14="http://schemas.microsoft.com/office/word/2010/wordprocessingDrawing" xmlns:wp="http://schemas.openxmlformats.org/drawingml/2006/wordprocessingDrawing" xmlns:w10="urn:schemas-microsoft-com:office:word" xmlns:w="http://schemas.openxmlformats.org/wordprocessingml/2006/main" xmlns:w14="http://schemas.microsoft.com/office/word/2010/wordml" xmlns:w15="http://schemas.microsoft.com/office/word/2012/wordml" xmlns:w16cex="http://schemas.microsoft.com/office/word/2018/wordml/cex" xmlns:w16cid="http://schemas.microsoft.com/office/word/2016/wordml/cid" xmlns:w16="http://schemas.microsoft.com/office/word/2018/wordml" xmlns:w16sdtdh="http://schemas.microsoft.com/office/word/2020/wordml/sdtdatahash" xmlns:w16se="http://schemas.microsoft.com/office/word/2015/wordml/symex" xmlns:wpg="http://schemas.microsoft.com/office/word/2010/wordprocessingGroup" xmlns:wpi="http://schemas.microsoft.com/office/word/2010/wordprocessingInk" xmlns:wne="http://schemas.microsoft.com/office/word/2006/wordml" xmlns:wps="http://schemas.microsoft.com/office/word/2010/wordprocessingShape" mc:Ignorable="w14 w15 w16se w16cid w16 w16cex w16sdtdh wp14">
   <w:docParts>
     <w:docPart>
       <w:docPartPr>
@@ -4670,6 +4760,18 @@
     <w:pitch w:val="variable"/>
     <w:sig w:usb0="E4002EFF" w:usb1="C000247B" w:usb2="00000009" w:usb3="00000000" w:csb0="000001FF" w:csb1="00000000"/>
   </w:font>
+  <w:font w:name="Aptos">
+    <w:charset w:val="00"/>
+    <w:family w:val="swiss"/>
+    <w:pitch w:val="variable"/>
+    <w:sig w:usb0="20000287" w:usb1="00000003" w:usb2="00000000" w:usb3="00000000" w:csb0="0000019F" w:csb1="00000000"/>
+  </w:font>
+  <w:font w:name="Aptos Display">
+    <w:charset w:val="00"/>
+    <w:family w:val="swiss"/>
+    <w:pitch w:val="variable"/>
+    <w:sig w:usb0="20000287" w:usb1="00000003" w:usb2="00000000" w:usb3="00000000" w:csb0="0000019F" w:csb1="00000000"/>
+  </w:font>
 </w:fonts>
 </file>
 
@@ -4702,7 +4804,9 @@
     <w:rsid w:val="006131D2"/>
     <w:rsid w:val="006660C2"/>
     <w:rsid w:val="006A5286"/>
+    <w:rsid w:val="006D7D00"/>
     <w:rsid w:val="006F1C58"/>
+    <w:rsid w:val="0074735C"/>
     <w:rsid w:val="007A0268"/>
     <w:rsid w:val="00874C34"/>
     <w:rsid w:val="008A3608"/>
@@ -4710,6 +4814,8 @@
     <w:rsid w:val="009102F8"/>
     <w:rsid w:val="00940BE1"/>
     <w:rsid w:val="00974CEF"/>
+    <w:rsid w:val="009C5772"/>
+    <w:rsid w:val="00B043C1"/>
     <w:rsid w:val="00B41BB7"/>
     <w:rsid w:val="00B42592"/>
     <w:rsid w:val="00B930D7"/>
@@ -4717,6 +4823,7 @@
     <w:rsid w:val="00C47AD1"/>
     <w:rsid w:val="00D20AFE"/>
     <w:rsid w:val="00D33FBB"/>
+    <w:rsid w:val="00D55574"/>
     <w:rsid w:val="00D97329"/>
     <w:rsid w:val="00DF0A6B"/>
     <w:rsid w:val="00E17F35"/>
@@ -4740,7 +4847,7 @@
   </m:mathPr>
   <w:themeFontLang w:val="en-US"/>
   <w:clrSchemeMapping w:bg1="light1" w:t1="dark1" w:bg2="light2" w:t2="dark2" w:accent1="accent1" w:accent2="accent2" w:accent3="accent3" w:accent4="accent4" w:accent5="accent5" w:accent6="accent6" w:hyperlink="hyperlink" w:followedHyperlink="followedHyperlink"/>
-  <w:decimalSymbol w:val=","/>
+  <w:decimalSymbol w:val="."/>
   <w:listSeparator w:val=","/>
   <w15:chartTrackingRefBased/>
 </w:settings>
@@ -5210,20 +5317,6 @@
       <w14:ligatures w14:val="none"/>
     </w:rPr>
   </w:style>
-  <w:style w:type="paragraph" w:customStyle="1" w:styleId="1B248AA8A40B4963ACEEC183DB04DC53">
-    <w:name w:val="1B248AA8A40B4963ACEEC183DB04DC53"/>
-    <w:rsid w:val="000A23A0"/>
-    <w:rPr>
-      <w:rFonts w:eastAsiaTheme="minorHAnsi"/>
-    </w:rPr>
-  </w:style>
-  <w:style w:type="paragraph" w:customStyle="1" w:styleId="4F8935F79C864A2B87A6D2224692058A">
-    <w:name w:val="4F8935F79C864A2B87A6D2224692058A"/>
-    <w:rsid w:val="000A23A0"/>
-    <w:rPr>
-      <w:rFonts w:eastAsiaTheme="minorHAnsi"/>
-    </w:rPr>
-  </w:style>
   <w:style w:type="paragraph" w:customStyle="1" w:styleId="65320A6CC3C34AFBB8890A9D838700DA">
     <w:name w:val="65320A6CC3C34AFBB8890A9D838700DA"/>
     <w:rsid w:val="006660C2"/>
@@ -5313,20 +5406,6 @@
       <w:sz w:val="22"/>
       <w:szCs w:val="22"/>
       <w14:ligatures w14:val="none"/>
-    </w:rPr>
-  </w:style>
-  <w:style w:type="paragraph" w:customStyle="1" w:styleId="1B248AA8A40B4963ACEEC183DB04DC531">
-    <w:name w:val="1B248AA8A40B4963ACEEC183DB04DC531"/>
-    <w:rsid w:val="007A0268"/>
-    <w:rPr>
-      <w:rFonts w:eastAsiaTheme="minorHAnsi"/>
-    </w:rPr>
-  </w:style>
-  <w:style w:type="paragraph" w:customStyle="1" w:styleId="4F8935F79C864A2B87A6D2224692058A1">
-    <w:name w:val="4F8935F79C864A2B87A6D2224692058A1"/>
-    <w:rsid w:val="007A0268"/>
-    <w:rPr>
-      <w:rFonts w:eastAsiaTheme="minorHAnsi"/>
     </w:rPr>
   </w:style>
   <w:style w:type="paragraph" w:customStyle="1" w:styleId="1B248AA8A40B4963ACEEC183DB04DC532">

</xml_diff>